<commit_message>
Update tenure to six years; swap memo sketch to Recycled Weapons Loop; add Proposed_Changes
- CV: 'seven years' -> 'six years'; Investigative Unit start 'Oct 2019' -> 'Dec 2019'
- index.html, CV_Print_Ready.html: matching tenure update
- build_docs.js: profile string + role header; regenerated CV/Cover Letter DOCX and PDF
- Investigative_Memo.md: replaced Disinformation Factories sketch with Recycled Weapons Loop
- Added Proposed_Changes.md with reviewer notes
- Expanded .gitignore
</commit_message>
<xml_diff>
--- a/Yarno_Ritzen_CV_NYT_OSINT.docx
+++ b/Yarno_Ritzen_CV_NYT_OSINT.docx
@@ -56,7 +56,7 @@
         <w:spacing w:after="80"/>
       </w:pPr>
       <w:r>
-        <w:t xml:space="preserve">Award-winning investigative journalist with eleven years at Al Jazeera — the last seven inside the Investigative Unit, after earlier producer roles on the digital news desk and interactive department. IRE-winning, BAFTA-nominated work combining satellite imagery analysis, geolocation and chronolocation, ship and aircraft tracking, and exclusive confidential datasets to produce accountability journalism across Asia, Africa, Europe and the Middle East. Solo reporter on self-conceived investigations and collaborator on team projects — comfortable delivering all-formats journalism in text, long-form video and interactive output, end-to-end.</w:t>
+        <w:t xml:space="preserve">Award-winning investigative journalist with eleven years at Al Jazeera — the last six inside the Investigative Unit, after earlier producer roles on the digital news desk and interactive department. IRE-winning, BAFTA-nominated work combining satellite imagery analysis, geolocation and chronolocation, ship and aircraft tracking, and exclusive confidential datasets to produce accountability journalism across Asia, Africa, Europe and the Middle East. Solo reporter on self-conceived investigations and collaborator on team projects — comfortable delivering all-formats journalism in text, long-form video and interactive output, end-to-end.</w:t>
       </w:r>
     </w:p>
     <w:p>
@@ -252,7 +252,7 @@
           <w:iCs/>
           <w:color w:val="555555"/>
         </w:rPr>
-        <w:t xml:space="preserve">	Doha, Qatar · Oct 2019 – Present</w:t>
+        <w:t xml:space="preserve">	Doha, Qatar · Dec 2019 – Present</w:t>
       </w:r>
     </w:p>
     <w:p>

</xml_diff>

<commit_message>
Tighten CV to two pages
- Removed NU.nl 2013 internship from the CV
- Title change for Interactive Department role: Assistant Producer -> Producer (already in CV.md from prior commit; this commit syncs build_docs.js, DOCX and PDF)
- Profile paragraph compressed; drops redundant 'earlier producer roles' clause
- Ghost Reporters description tightened
- All the Prime Minister's Men bullet consolidated
- Interactive Department reduced from two bullets to one combined bullet
- OSINT Toolbox: dropped redundant Storytelling bullet, added Git/Bash/GIS to Custom tooling line
- Heading2 spacing slightly increased for visual breathing room
- Regenerated DOCX and PDF (now 2 pages)
</commit_message>
<xml_diff>
--- a/Yarno_Ritzen_CV_NYT_OSINT.docx
+++ b/Yarno_Ritzen_CV_NYT_OSINT.docx
@@ -56,7 +56,7 @@
         <w:spacing w:after="80"/>
       </w:pPr>
       <w:r>
-        <w:t xml:space="preserve">Award-winning investigative journalist with eleven years at Al Jazeera — the last six inside the Investigative Unit, after earlier producer roles on the digital news desk and interactive department. IRE-winning, BAFTA-nominated work combining satellite imagery analysis, geolocation and chronolocation, ship and aircraft tracking, and exclusive confidential datasets to produce accountability journalism across Asia, Africa, Europe and the Middle East. Solo reporter on self-conceived investigations and collaborator on team projects — comfortable delivering all-formats journalism in text, long-form video and interactive output, end-to-end.</w:t>
+        <w:t xml:space="preserve">Award-winning investigative journalist with eleven years at Al Jazeera — six inside the Investigative Unit. IRE-winning, BAFTA-nominated work combining satellite imagery analysis, geolocation and chronolocation, ship and aircraft tracking, and confidential datasets to produce accountability journalism across Asia, Africa, Europe and the Middle East. Solo on self-conceived investigations and collaborator on team projects, delivering across text, long-form video and interactive formats.</w:t>
       </w:r>
     </w:p>
     <w:p>
@@ -84,7 +84,7 @@
         <w:spacing w:after="80"/>
       </w:pPr>
       <w:r>
-        <w:t xml:space="preserve">Exposed a Russia-linked influence campaign using 15+ fictitious journalists and at least 200 paid-for articles seeded across Francophone Africa to amplify anti-French, pro-Russian narratives. Identified the stolen identity behind the lead persona — a deceased Central African teacher — via reverse image analysis; surfaced Cyrillic strings and a Russian phone number inside Word-document metadata; reverse-traced the number to a former Internet Research Agency operator with Wagner Group ties. Published as a long-form text feature and a 25-minute documentary.</w:t>
+        <w:t xml:space="preserve">Exposed a Russia-linked influence campaign using 15+ fictitious journalists and 200+ paid-for articles seeded across Francophone Africa. Identified the deceased Central African teacher whose photo was stolen for the lead persona, surfaced Cyrillic strings and a Russian phone number inside Word-document metadata, and reverse-traced the number to a former Internet Research Agency operator with Wagner Group ties. Published as long-form text and a 25-minute documentary.</w:t>
       </w:r>
     </w:p>
     <w:p>
@@ -169,7 +169,7 @@
         <w:spacing w:after="60"/>
       </w:pPr>
       <w:r>
-        <w:t xml:space="preserve">All the Prime Minister’s Men (Amnesty Media Award, 2022) — OSINT on financial and corporate trails of a sitting head of government. Solo follow-up exclusive (Dec 2022) revealed UK spy-training trips by a paramilitary unit later sanctioned for human-rights abuses; the named former army chief was sanctioned by the US Treasury in 2024.</w:t>
+        <w:t xml:space="preserve">All the Prime Minister’s Men (Amnesty Media Award, 2022) — OSINT on the financial and corporate trails of a sitting head of government; my solo follow-up surfaced UK spy-training trips by a paramilitary unit later sanctioned for human-rights abuses, and the named army chief was sanctioned by the US Treasury in 2024.</w:t>
       </w:r>
     </w:p>
     <w:p>
@@ -394,7 +394,7 @@
           <w:b/>
           <w:bCs/>
         </w:rPr>
-        <w:t xml:space="preserve">Assistant Producer — Al Jazeera Interactive Department</w:t>
+        <w:t xml:space="preserve">Producer — Al Jazeera Interactive Department</w:t>
       </w:r>
       <w:r>
         <w:rPr>
@@ -415,56 +415,7 @@
         <w:spacing w:after="60"/>
       </w:pPr>
       <w:r>
-        <w:t xml:space="preserve">Built data-driven infographics and interactive web productions embedded in long-form journalism.</w:t>
-      </w:r>
-    </w:p>
-    <w:p>
-      <w:pPr>
-        <w:pStyle w:val="ListParagraph"/>
-        <w:numPr>
-          <w:ilvl w:val="0"/>
-          <w:numId w:val="2"/>
-        </w:numPr>
-        <w:spacing w:after="60"/>
-      </w:pPr>
-      <w:r>
-        <w:t xml:space="preserve">Explored emerging visual storytelling: 360-degree video, VR and gamified explainers. Multiple Online Media and Webby recognitions with the team.</w:t>
-      </w:r>
-    </w:p>
-    <w:p>
-      <w:pPr>
-        <w:tabs>
-          <w:tab w:val="right" w:pos="9026"/>
-        </w:tabs>
-        <w:spacing w:after="20" w:before="80"/>
-      </w:pPr>
-      <w:r>
-        <w:rPr>
-          <w:b/>
-          <w:bCs/>
-        </w:rPr>
-        <w:t xml:space="preserve">Producer (intern) — NU.nl</w:t>
-      </w:r>
-      <w:r>
-        <w:rPr>
-          <w:i/>
-          <w:iCs/>
-          <w:color w:val="555555"/>
-        </w:rPr>
-        <w:t xml:space="preserve">	Hoofddorp, Netherlands · Aug – Dec 2013</w:t>
-      </w:r>
-    </w:p>
-    <w:p>
-      <w:pPr>
-        <w:pStyle w:val="ListParagraph"/>
-        <w:numPr>
-          <w:ilvl w:val="0"/>
-          <w:numId w:val="2"/>
-        </w:numPr>
-        <w:spacing w:after="60"/>
-      </w:pPr>
-      <w:r>
-        <w:t xml:space="preserve">Data journalism, infographics, and original news reporting.</w:t>
+        <w:t xml:space="preserve">Built data-driven infographics and interactive web productions embedded in long-form journalism; explored emerging visual storytelling — 360-degree video, VR, gamified explainers — with multiple Online Media and Webby recognitions.</w:t>
       </w:r>
     </w:p>
     <w:p>
@@ -572,27 +523,7 @@
         <w:t xml:space="preserve">Custom tooling &amp; AI: </w:t>
       </w:r>
       <w:r>
-        <w:t xml:space="preserve">build editorial scrapers, monitors and data pipelines using AI-assisted coding (Claude Code, Gemini CLI); comfortable on the command line and working from engineer-built systems through to bespoke CMSes.</w:t>
-      </w:r>
-    </w:p>
-    <w:p>
-      <w:pPr>
-        <w:pStyle w:val="ListParagraph"/>
-        <w:numPr>
-          <w:ilvl w:val="0"/>
-          <w:numId w:val="2"/>
-        </w:numPr>
-        <w:spacing w:after="60"/>
-      </w:pPr>
-      <w:r>
-        <w:rPr>
-          <w:b/>
-          <w:bCs/>
-        </w:rPr>
-        <w:t xml:space="preserve">Storytelling: </w:t>
-      </w:r>
-      <w:r>
-        <w:t xml:space="preserve">news writing, long-form features, documentary scripts, explainers, and interactive web productions.</w:t>
+        <w:t xml:space="preserve">build editorial scrapers, monitors and data pipelines using AI-assisted coding (Claude Code, Gemini CLI); production deployment with Git and Bash, plus GIS and cartographic workflows for geospatial analysis.</w:t>
       </w:r>
     </w:p>
     <w:p>
@@ -1098,7 +1029,7 @@
       <w:pBdr>
         <w:bottom w:val="single" w:color="888888" w:sz="6" w:space="2"/>
       </w:pBdr>
-      <w:spacing w:after="40" w:before="160"/>
+      <w:spacing w:after="80" w:before="220"/>
       <w:outlineLvl w:val="1"/>
     </w:pPr>
     <w:rPr>

</xml_diff>